<commit_message>
WIP: uncommitted changes, moved to the cloud
Snapshot of the working tree the Claude desktop app took to continue
this session in the cloud. It was never committed on the desktop; fold
it into your next commit (git commit --amend) or unstage it
(git reset --mixed HEAD~1) before committing for real.
</commit_message>
<xml_diff>
--- a/보고서/서식4_20260923/안동이어드림_서식4_활용사례_20260923.docx
+++ b/보고서/서식4_20260923/안동이어드림_서식4_활용사례_20260923.docx
@@ -578,7 +578,23 @@
           <w:b w:val="0"/>
           <w:sz w:val="22"/>
         </w:rPr>
-        <w:t xml:space="preserve"> 월영교 방문객 유입(외곽 관광객 54.8% 집결) 대비 야간 식사 가능 업소 18.8%(16곳 중 3곳)로 소비 전환 한계</w:t>
+        <w:t xml:space="preserve"> 만휴정·도산서원 방문객 절반 이상이 월영교로 모이지만, 반경 1km 음식점 16곳 중 </w:t>
+      </w:r>
+      <w:r>
+        <w:rPr>
+          <w:rFonts w:ascii="함초롬바탕" w:hAnsi="함초롬바탕" w:eastAsia="함초롬바탕"/>
+          <w:b/>
+          <w:sz w:val="22"/>
+        </w:rPr>
+        <w:t>13곳(81%)이 21시 전 식사 마감</w:t>
+      </w:r>
+      <w:r>
+        <w:rPr>
+          <w:rFonts w:ascii="함초롬바탕" w:hAnsi="함초롬바탕" w:eastAsia="함초롬바탕"/>
+          <w:b w:val="0"/>
+          <w:sz w:val="22"/>
+        </w:rPr>
+        <w:t>·주점 0곳 → 모인 사람이 돈 쓸 곳이 없음</w:t>
       </w:r>
     </w:p>
     <w:p>
@@ -591,7 +607,7 @@
           <w:b w:val="0"/>
           <w:sz w:val="21"/>
         </w:rPr>
-        <w:t>- 외곽 주요 관광지 방문객의 절반 이상이 월영교를 함께 찾음(만휴정 54.8%, 도산서원 54.2%)</w:t>
+        <w:t>- 외곽 주요 관광지 방문객의 절반 이상이 월영교를 함께 찾음(만휴정 54.8%, 도산서원 54.2%, 전체 평균 30.9%의 1.8배)</w:t>
       </w:r>
     </w:p>
     <w:p>
@@ -1316,7 +1332,7 @@
           <w:b w:val="0"/>
           <w:sz w:val="20"/>
         </w:rPr>
-        <w:t>○ 아직 정하지 않은 것: 팝업 부스 수·차량 대수(이용량·견적 확인 후), 주민증 조건형 혜택 가능 여부(안 되면 영수증 QR 방식)</w:t>
+        <w:t>○ 아직 정하지 않은 것: 팝업 부스 수·차량 대수(이용량·견적 확인 후). 인증은 영수증 QR(누구나)과 주민증 조건형 혜택을 병행(조건형 가능 여부 확인 중)</w:t>
       </w:r>
     </w:p>
     <w:p>
@@ -1433,7 +1449,7 @@
           <w:b/>
           <w:sz w:val="22"/>
         </w:rPr>
-        <w:t>[원도심 체험 회복]</w:t>
+        <w:t>[체험 소비 회복]</w:t>
       </w:r>
       <w:r>
         <w:rPr>
@@ -1441,7 +1457,7 @@
           <w:b w:val="0"/>
           <w:sz w:val="22"/>
         </w:rPr>
-        <w:t xml:space="preserve"> 원도심 방문객 100명 중 2명 참여 시 체험 결제 </w:t>
+        <w:t xml:space="preserve"> 방문당 체험·문화 소비 감소폭 −16.8%(146곳 중 22위) → 참여 2%면 −13.9%(27위), 10명 중 1명 참여하면 </w:t>
       </w:r>
       <w:r>
         <w:rPr>
@@ -1449,7 +1465,7 @@
           <w:b/>
           <w:sz w:val="22"/>
         </w:rPr>
-        <w:t>연 2.2만 건</w:t>
+        <w:t>−2.5%로 전국 중앙 수준</w:t>
       </w:r>
       <w:r>
         <w:rPr>
@@ -1457,23 +1473,7 @@
           <w:b w:val="0"/>
           <w:sz w:val="22"/>
         </w:rPr>
-        <w:t xml:space="preserve">, 방문 1회당 체험·문화 소비 </w:t>
-      </w:r>
-      <w:r>
-        <w:rPr>
-          <w:rFonts w:ascii="함초롬바탕" w:hAnsi="함초롬바탕" w:eastAsia="함초롬바탕"/>
-          <w:b/>
-          <w:sz w:val="22"/>
-        </w:rPr>
-        <w:t>+3.5%</w:t>
-      </w:r>
-      <w:r>
-        <w:rPr>
-          <w:rFonts w:ascii="함초롬바탕" w:hAnsi="함초롬바탕" w:eastAsia="함초롬바탕"/>
-          <w:b w:val="0"/>
-          <w:sz w:val="22"/>
-        </w:rPr>
-        <w:t>(전국보다 더 줄어든 폭의 20% 회복), 안동 소비 연 1.6억 원 증가</w:t>
+        <w:t>(−2.0%)</w:t>
       </w:r>
     </w:p>
     <w:p>
@@ -1494,7 +1494,7 @@
           <w:b/>
           <w:sz w:val="22"/>
         </w:rPr>
-        <w:t>[흥행 조건과 효과]</w:t>
+        <w:t>[원도심 혜택 공백·주민증 활성화]</w:t>
       </w:r>
       <w:r>
         <w:rPr>
@@ -1502,7 +1502,7 @@
           <w:b w:val="0"/>
           <w:sz w:val="22"/>
         </w:rPr>
-        <w:t xml:space="preserve"> 100명 중 4명(여행비 절반을 돌려준 강진 반값여행 수준)이면 +6.8%, 식당이 모든 손님에게 안내해 10명 중 1명이 참여하면 </w:t>
+        <w:t xml:space="preserve"> 방문 1위 원도심의 혜택 업체 </w:t>
       </w:r>
       <w:r>
         <w:rPr>
@@ -1510,7 +1510,7 @@
           <w:b/>
           <w:sz w:val="22"/>
         </w:rPr>
-        <w:t>+17.2%</w:t>
+        <w:t>0곳 → 83곳</w:t>
       </w:r>
       <w:r>
         <w:rPr>
@@ -1518,7 +1518,7 @@
           <w:b w:val="0"/>
           <w:sz w:val="22"/>
         </w:rPr>
-        <w:t>(전국보다 더 줄어든 폭의 97% 회복). 절반을 되찾으려면 100명 중 약 5명 참여가 필요하고, 이 참여율은 계산대에서 얼마나 안내하느냐에 달림</w:t>
+        <w:t>(식당 → 체험 인증 월 5,452건), 주민증 조건형 혜택 병행 시 주민증 이용 월 888건 → 약 1,150건(+30%)</w:t>
       </w:r>
     </w:p>
     <w:p>
@@ -1547,7 +1547,7 @@
           <w:b w:val="0"/>
           <w:sz w:val="22"/>
         </w:rPr>
-        <w:t xml:space="preserve"> 셔틀·택시로 월영교에 새로 가는 저녁 이동 </w:t>
+        <w:t xml:space="preserve"> 19시 이후 버스 0회 → 월영교에 새로 가는 저녁 이동 </w:t>
       </w:r>
       <w:r>
         <w:rPr>
@@ -1563,7 +1563,7 @@
           <w:b w:val="0"/>
           <w:sz w:val="22"/>
         </w:rPr>
-        <w:t>, 월영교 팝업 이용 주말 하루 128명, 늘어난 소비 중 34%는 세 단계를 이어야만 생김</w:t>
+        <w:t>, 주점 0곳 → 야간 팝업 이용 주말 하루 128명</w:t>
       </w:r>
     </w:p>
     <w:p>
@@ -1584,7 +1584,7 @@
           <w:b/>
           <w:sz w:val="22"/>
         </w:rPr>
-        <w:t>[수요 확인]</w:t>
+        <w:t>[지역 소비]</w:t>
       </w:r>
       <w:r>
         <w:rPr>
@@ -1592,7 +1592,23 @@
           <w:b w:val="0"/>
           <w:sz w:val="22"/>
         </w:rPr>
-        <w:t xml:space="preserve"> 방문객 설문 체험 할인 쿠폰 이용 의향 79%, 야간 셔틀 79%, 야간 팝업 82%(이 중 33~40%만 실제 행동으로 계산에 반영)</w:t>
+        <w:t xml:space="preserve"> 안동 추가 소비 </w:t>
+      </w:r>
+      <w:r>
+        <w:rPr>
+          <w:rFonts w:ascii="함초롬바탕" w:hAnsi="함초롬바탕" w:eastAsia="함초롬바탕"/>
+          <w:b/>
+          <w:sz w:val="22"/>
+        </w:rPr>
+        <w:t>연 1.56억 원</w:t>
+      </w:r>
+      <w:r>
+        <w:rPr>
+          <w:rFonts w:ascii="함초롬바탕" w:hAnsi="함초롬바탕" w:eastAsia="함초롬바탕"/>
+          <w:b w:val="0"/>
+          <w:sz w:val="22"/>
+        </w:rPr>
+        <w:t>(할인액·원래 썼을 돈 제외), 이 중 34%는 세 단계를 이어야만 생김</w:t>
       </w:r>
     </w:p>
     <w:p>
@@ -1621,7 +1637,7 @@
           <w:b w:val="0"/>
           <w:sz w:val="22"/>
         </w:rPr>
-        <w:t xml:space="preserve"> 추첨 순서로 식당을 열어 83곳·5개월이면 체험 결제 +50% 효과를 85% 확률로 확인, 전국에서 안동과 같은 유형 6곳(영덕·양양·남해·울진·광명·강릉) 도출, 주민증 운영 52개 지자체(안동 포함)에 적용 가능</w:t>
+        <w:t xml:space="preserve"> 식당 83곳을 추첨 순서로 열면 5개월 만에 효과를 85% 확률로 확인, 안동과 같은 유형 6곳(영덕·양양·남해·울진·광명·강릉)·주민증 운영 52개 지자체에 적용 가능</w:t>
       </w:r>
     </w:p>
     <w:tbl>
@@ -1735,7 +1751,7 @@
                 <w:b w:val="0"/>
                 <w:sz w:val="19"/>
               </w:rPr>
-              <w:t>체험 결제(연간)</w:t>
+              <w:t>방문당 체험·문화 소비(지금 152.7원, −16.8%)</w:t>
             </w:r>
           </w:p>
         </w:tc>
@@ -1754,7 +1770,7 @@
                 <w:b w:val="0"/>
                 <w:sz w:val="19"/>
               </w:rPr>
-              <w:t>22,019건</w:t>
+              <w:t>158.0원(−13.9%)</w:t>
             </w:r>
           </w:p>
         </w:tc>
@@ -1773,7 +1789,7 @@
                 <w:b w:val="0"/>
                 <w:sz w:val="19"/>
               </w:rPr>
-              <w:t>43,975건</w:t>
+              <w:t>163.1원(−11.1%)</w:t>
             </w:r>
           </w:p>
         </w:tc>
@@ -1792,7 +1808,7 @@
                 <w:b w:val="0"/>
                 <w:sz w:val="19"/>
               </w:rPr>
-              <w:t>109,915건</w:t>
+              <w:t>179.0원(−2.5%)</w:t>
             </w:r>
           </w:p>
         </w:tc>
@@ -1813,7 +1829,7 @@
                 <w:b w:val="0"/>
                 <w:sz w:val="19"/>
               </w:rPr>
-              <w:t>방문 1회당 체험·문화 소비</w:t>
+              <w:t>146곳 중 감소폭 순위(지금 22위)</w:t>
             </w:r>
           </w:p>
         </w:tc>
@@ -1832,7 +1848,7 @@
                 <w:b w:val="0"/>
                 <w:sz w:val="19"/>
               </w:rPr>
-              <w:t>+3.5%</w:t>
+              <w:t>27위</w:t>
             </w:r>
           </w:p>
         </w:tc>
@@ -1851,7 +1867,7 @@
                 <w:b w:val="0"/>
                 <w:sz w:val="19"/>
               </w:rPr>
-              <w:t>+6.8%</w:t>
+              <w:t>38위</w:t>
             </w:r>
           </w:p>
         </w:tc>
@@ -1870,85 +1886,7 @@
                 <w:b w:val="0"/>
                 <w:sz w:val="19"/>
               </w:rPr>
-              <w:t>+17.2%</w:t>
-            </w:r>
-          </w:p>
-        </w:tc>
-      </w:tr>
-      <w:tr>
-        <w:tc>
-          <w:tcPr>
-            <w:tcW w:type="dxa" w:w="2948"/>
-          </w:tcPr>
-          <w:p>
-            <w:pPr>
-              <w:spacing w:line="300" w:lineRule="auto"/>
-            </w:pPr>
-            <w:r/>
-            <w:r>
-              <w:rPr>
-                <w:rFonts w:ascii="함초롬바탕" w:hAnsi="함초롬바탕" w:eastAsia="함초롬바탕"/>
-                <w:b w:val="0"/>
-                <w:sz w:val="19"/>
-              </w:rPr>
-              <w:t>전국보다 더 줄어든 폭 중 되찾는 비율</w:t>
-            </w:r>
-          </w:p>
-        </w:tc>
-        <w:tc>
-          <w:tcPr>
-            <w:tcW w:type="dxa" w:w="2268"/>
-          </w:tcPr>
-          <w:p>
-            <w:pPr>
-              <w:spacing w:line="300" w:lineRule="auto"/>
-            </w:pPr>
-            <w:r/>
-            <w:r>
-              <w:rPr>
-                <w:rFonts w:ascii="함초롬바탕" w:hAnsi="함초롬바탕" w:eastAsia="함초롬바탕"/>
-                <w:b w:val="0"/>
-                <w:sz w:val="19"/>
-              </w:rPr>
-              <w:t>20%</w:t>
-            </w:r>
-          </w:p>
-        </w:tc>
-        <w:tc>
-          <w:tcPr>
-            <w:tcW w:type="dxa" w:w="2154"/>
-          </w:tcPr>
-          <w:p>
-            <w:pPr>
-              <w:spacing w:line="300" w:lineRule="auto"/>
-            </w:pPr>
-            <w:r/>
-            <w:r>
-              <w:rPr>
-                <w:rFonts w:ascii="함초롬바탕" w:hAnsi="함초롬바탕" w:eastAsia="함초롬바탕"/>
-                <w:b w:val="0"/>
-                <w:sz w:val="19"/>
-              </w:rPr>
-              <w:t>39%</w:t>
-            </w:r>
-          </w:p>
-        </w:tc>
-        <w:tc>
-          <w:tcPr>
-            <w:tcW w:type="dxa" w:w="2268"/>
-          </w:tcPr>
-          <w:p>
-            <w:pPr>
-              <w:spacing w:line="300" w:lineRule="auto"/>
-            </w:pPr>
-            <w:r/>
-            <w:r>
-              <w:rPr>
-                <w:rFonts w:ascii="함초롬바탕" w:hAnsi="함초롬바탕" w:eastAsia="함초롬바탕"/>
-                <w:b w:val="0"/>
-                <w:sz w:val="19"/>
-              </w:rPr>
-              <w:t>97%</w:t>
+              <w:t>71위</w:t>
             </w:r>
           </w:p>
         </w:tc>
@@ -2120,7 +2058,7 @@
           <w:b w:val="0"/>
           <w:sz w:val="19"/>
         </w:rPr>
-        <w:t>* 효과는 시행 전 예측(2026년 1~8월 자료의 연간 환산, 1만 번 계산의 가운데 값, 할인액·원래 썼을 돈 제외)이며 시행 첫 달 실제 기록으로 다시 계산. 참고자료 zip: 분석보고서(PDF)·데이터 대시보드(엑셀)·전국 진단표·분석 스크립트</w:t>
+        <w:t>* 효과는 시행 전 예측(2026년 1~8월 자료의 연간 환산, 1만 번 계산의 가운데 값, 할인액·원래 썼을 돈 제외)이며 시행 첫 달 실제 기록으로 다시 계산. 순위는 다른 시·군이 그대로일 때. 참고자료 zip: 분석보고서(PDF)·데이터 대시보드(엑셀)·전국 진단표·분석 스크립트</w:t>
       </w:r>
     </w:p>
     <w:sectPr>

</xml_diff>